<commit_message>
FIn pactca 6- prueba doc xps
</commit_message>
<xml_diff>
--- a/2_Laboratorio/L06_Tema/docs/Plantilla.docx
+++ b/2_Laboratorio/L06_Tema/docs/Plantilla.docx
@@ -2510,10 +2510,10 @@
             <v:path o:extrusionok="f" gradientshapeok="t" o:connecttype="rect"/>
             <o:lock v:ext="edit" aspectratio="t"/>
           </v:shapetype>
-          <v:shape id="_x0000_i1145" type="#_x0000_t75" style="width:509pt;height:580.4pt" o:ole="">
+          <v:shape id="_x0000_i1025" type="#_x0000_t75" style="width:509.25pt;height:580.5pt" o:ole="">
             <v:imagedata r:id="rId14" o:title=""/>
           </v:shape>
-          <o:OLEObject Type="Embed" ProgID="Word.OpenDocumentText.12" ShapeID="_x0000_i1145" DrawAspect="Content" ObjectID="_1834692630" r:id="rId15"/>
+          <o:OLEObject Type="Embed" ProgID="Word.OpenDocumentText.12" ShapeID="_x0000_i1025" DrawAspect="Content" ObjectID="_1834696160" r:id="rId15"/>
         </w:object>
       </w:r>
     </w:p>
@@ -2522,10 +2522,10 @@
     <w:p>
       <w:r>
         <w:object w:dxaOrig="12240" w:dyaOrig="2510" w14:anchorId="6DC7A4FC">
-          <v:shape id="_x0000_i1146" type="#_x0000_t75" style="width:509pt;height:104.55pt" o:ole="">
+          <v:shape id="_x0000_i1026" type="#_x0000_t75" style="width:509.25pt;height:104.25pt" o:ole="">
             <v:imagedata r:id="rId16" o:title=""/>
           </v:shape>
-          <o:OLEObject Type="Embed" ProgID="Word.OpenDocumentText.12" ShapeID="_x0000_i1146" DrawAspect="Content" ObjectID="_1834692631" r:id="rId17"/>
+          <o:OLEObject Type="Embed" ProgID="Word.OpenDocumentText.12" ShapeID="_x0000_i1026" DrawAspect="Content" ObjectID="_1834696161" r:id="rId17"/>
         </w:object>
       </w:r>
     </w:p>
@@ -2569,10 +2569,10 @@
     <w:p>
       <w:r>
         <w:object w:dxaOrig="12240" w:dyaOrig="15675" w14:anchorId="254165C4">
-          <v:shape id="_x0000_i1025" type="#_x0000_t75" style="width:488.95pt;height:626.1pt" o:ole="">
+          <v:shape id="_x0000_i1027" type="#_x0000_t75" style="width:489pt;height:626.25pt" o:ole="">
             <v:imagedata r:id="rId18" o:title=""/>
           </v:shape>
-          <o:OLEObject Type="Embed" ProgID="Word.OpenDocumentText.12" ShapeID="_x0000_i1025" DrawAspect="Content" ObjectID="_1834692632" r:id="rId19"/>
+          <o:OLEObject Type="Embed" ProgID="Word.OpenDocumentText.12" ShapeID="_x0000_i1027" DrawAspect="Content" ObjectID="_1834696162" r:id="rId19"/>
         </w:object>
       </w:r>
     </w:p>
@@ -2596,10 +2596,10 @@
     <w:p>
       <w:r>
         <w:object w:dxaOrig="12240" w:dyaOrig="4560" w14:anchorId="15E091A3">
-          <v:shape id="_x0000_i1026" type="#_x0000_t75" style="width:488.95pt;height:182.2pt" o:ole="">
+          <v:shape id="_x0000_i1028" type="#_x0000_t75" style="width:489pt;height:182.25pt" o:ole="">
             <v:imagedata r:id="rId20" o:title=""/>
           </v:shape>
-          <o:OLEObject Type="Embed" ProgID="Word.OpenDocumentText.12" ShapeID="_x0000_i1026" DrawAspect="Content" ObjectID="_1834692633" r:id="rId21"/>
+          <o:OLEObject Type="Embed" ProgID="Word.OpenDocumentText.12" ShapeID="_x0000_i1028" DrawAspect="Content" ObjectID="_1834696163" r:id="rId21"/>
         </w:object>
       </w:r>
     </w:p>
@@ -2638,10 +2638,10 @@
     <w:p>
       <w:r>
         <w:object w:dxaOrig="12240" w:dyaOrig="12255" w14:anchorId="6FA54A3B">
-          <v:shape id="_x0000_i1027" type="#_x0000_t75" style="width:488.95pt;height:489.6pt" o:ole="">
+          <v:shape id="_x0000_i1029" type="#_x0000_t75" style="width:489pt;height:489.75pt" o:ole="">
             <v:imagedata r:id="rId22" o:title=""/>
           </v:shape>
-          <o:OLEObject Type="Embed" ProgID="Word.OpenDocumentText.12" ShapeID="_x0000_i1027" DrawAspect="Content" ObjectID="_1834692634" r:id="rId23"/>
+          <o:OLEObject Type="Embed" ProgID="Word.OpenDocumentText.12" ShapeID="_x0000_i1029" DrawAspect="Content" ObjectID="_1834696164" r:id="rId23"/>
         </w:object>
       </w:r>
     </w:p>
@@ -2668,10 +2668,10 @@
     <w:p>
       <w:r>
         <w:object w:dxaOrig="12240" w:dyaOrig="6270" w14:anchorId="2F53F49A">
-          <v:shape id="_x0000_i1075" type="#_x0000_t75" style="width:488.95pt;height:250.45pt" o:ole="">
+          <v:shape id="_x0000_i1030" type="#_x0000_t75" style="width:489pt;height:250.5pt" o:ole="">
             <v:imagedata r:id="rId24" o:title=""/>
           </v:shape>
-          <o:OLEObject Type="Embed" ProgID="Word.OpenDocumentText.12" ShapeID="_x0000_i1075" DrawAspect="Content" ObjectID="_1834692635" r:id="rId25"/>
+          <o:OLEObject Type="Embed" ProgID="Word.OpenDocumentText.12" ShapeID="_x0000_i1030" DrawAspect="Content" ObjectID="_1834696165" r:id="rId25"/>
         </w:object>
       </w:r>
     </w:p>
@@ -2718,10 +2718,10 @@
     <w:p>
       <w:r>
         <w:object w:dxaOrig="12240" w:dyaOrig="14820" w14:anchorId="0C663965">
-          <v:shape id="_x0000_i1029" type="#_x0000_t75" style="width:488.95pt;height:592.3pt" o:ole="">
+          <v:shape id="_x0000_i1031" type="#_x0000_t75" style="width:489pt;height:591.75pt" o:ole="">
             <v:imagedata r:id="rId26" o:title=""/>
           </v:shape>
-          <o:OLEObject Type="Embed" ProgID="Word.OpenDocumentText.12" ShapeID="_x0000_i1029" DrawAspect="Content" ObjectID="_1834692636" r:id="rId27"/>
+          <o:OLEObject Type="Embed" ProgID="Word.OpenDocumentText.12" ShapeID="_x0000_i1031" DrawAspect="Content" ObjectID="_1834696166" r:id="rId27"/>
         </w:object>
       </w:r>
     </w:p>
@@ -2730,10 +2730,10 @@
     <w:p>
       <w:r>
         <w:object w:dxaOrig="12240" w:dyaOrig="2280" w14:anchorId="34EB94F8">
-          <v:shape id="_x0000_i1030" type="#_x0000_t75" style="width:488.95pt;height:90.8pt" o:ole="">
+          <v:shape id="_x0000_i1032" type="#_x0000_t75" style="width:489pt;height:90.75pt" o:ole="">
             <v:imagedata r:id="rId28" o:title=""/>
           </v:shape>
-          <o:OLEObject Type="Embed" ProgID="Word.OpenDocumentText.12" ShapeID="_x0000_i1030" DrawAspect="Content" ObjectID="_1834692637" r:id="rId29"/>
+          <o:OLEObject Type="Embed" ProgID="Word.OpenDocumentText.12" ShapeID="_x0000_i1032" DrawAspect="Content" ObjectID="_1834696167" r:id="rId29"/>
         </w:object>
       </w:r>
     </w:p>
@@ -2755,10 +2755,10 @@
     <w:p>
       <w:r>
         <w:object w:dxaOrig="12240" w:dyaOrig="3420" w14:anchorId="56647044">
-          <v:shape id="_x0000_i1048" type="#_x0000_t75" style="width:526.55pt;height:147.15pt" o:ole="">
+          <v:shape id="_x0000_i1033" type="#_x0000_t75" style="width:526.5pt;height:147pt" o:ole="">
             <v:imagedata r:id="rId30" o:title=""/>
           </v:shape>
-          <o:OLEObject Type="Embed" ProgID="Word.OpenDocumentText.12" ShapeID="_x0000_i1048" DrawAspect="Content" ObjectID="_1834692638" r:id="rId31"/>
+          <o:OLEObject Type="Embed" ProgID="Word.OpenDocumentText.12" ShapeID="_x0000_i1033" DrawAspect="Content" ObjectID="_1834696168" r:id="rId31"/>
         </w:object>
       </w:r>
     </w:p>
@@ -2797,10 +2797,10 @@
     <w:p>
       <w:r>
         <w:object w:dxaOrig="12240" w:dyaOrig="12255" w14:anchorId="45DB767A">
-          <v:shape id="_x0000_i1031" type="#_x0000_t75" style="width:488.95pt;height:489.6pt" o:ole="">
+          <v:shape id="_x0000_i1034" type="#_x0000_t75" style="width:489pt;height:489.75pt" o:ole="">
             <v:imagedata r:id="rId32" o:title=""/>
           </v:shape>
-          <o:OLEObject Type="Embed" ProgID="Word.OpenDocumentText.12" ShapeID="_x0000_i1031" DrawAspect="Content" ObjectID="_1834692639" r:id="rId33"/>
+          <o:OLEObject Type="Embed" ProgID="Word.OpenDocumentText.12" ShapeID="_x0000_i1034" DrawAspect="Content" ObjectID="_1834696169" r:id="rId33"/>
         </w:object>
       </w:r>
     </w:p>
@@ -2821,10 +2821,10 @@
     <w:p>
       <w:r>
         <w:object w:dxaOrig="12240" w:dyaOrig="3420" w14:anchorId="2E9AEBB3">
-          <v:shape id="_x0000_i1069" type="#_x0000_t75" style="width:509pt;height:142.1pt" o:ole="">
+          <v:shape id="_x0000_i1035" type="#_x0000_t75" style="width:509.25pt;height:141.75pt" o:ole="">
             <v:imagedata r:id="rId34" o:title=""/>
           </v:shape>
-          <o:OLEObject Type="Embed" ProgID="Word.OpenDocumentText.12" ShapeID="_x0000_i1069" DrawAspect="Content" ObjectID="_1834692640" r:id="rId35"/>
+          <o:OLEObject Type="Embed" ProgID="Word.OpenDocumentText.12" ShapeID="_x0000_i1035" DrawAspect="Content" ObjectID="_1834696170" r:id="rId35"/>
         </w:object>
       </w:r>
     </w:p>
@@ -2862,6 +2862,9 @@
         </w:tabs>
       </w:pPr>
       <w:r>
+        <w:rPr>
+          <w:noProof/>
+        </w:rPr>
         <w:drawing>
           <wp:inline distT="0" distB="0" distL="0" distR="0" wp14:anchorId="6D83C02B" wp14:editId="1BB59D26">
             <wp:extent cx="6858000" cy="1769110"/>
@@ -2921,6 +2924,9 @@
         </w:tabs>
       </w:pPr>
       <w:r>
+        <w:rPr>
+          <w:noProof/>
+        </w:rPr>
         <w:drawing>
           <wp:inline distT="0" distB="0" distL="0" distR="0" wp14:anchorId="7142155C" wp14:editId="1AF18085">
             <wp:extent cx="6858000" cy="1100455"/>
@@ -2987,6 +2993,9 @@
     </w:p>
     <w:p>
       <w:r>
+        <w:rPr>
+          <w:noProof/>
+        </w:rPr>
         <w:lastRenderedPageBreak/>
         <w:drawing>
           <wp:inline distT="0" distB="0" distL="0" distR="0" wp14:anchorId="6B87E138" wp14:editId="37B8E09D">
@@ -3037,6 +3046,9 @@
         <w:t>.</w:t>
       </w:r>
       <w:r>
+        <w:rPr>
+          <w:noProof/>
+        </w:rPr>
         <w:drawing>
           <wp:inline distT="0" distB="0" distL="0" distR="0" wp14:anchorId="192DCF39" wp14:editId="2C8FF152">
             <wp:extent cx="6858000" cy="1591945"/>
@@ -3095,6 +3107,9 @@
     </w:p>
     <w:p>
       <w:r>
+        <w:rPr>
+          <w:noProof/>
+        </w:rPr>
         <w:drawing>
           <wp:inline distT="0" distB="0" distL="0" distR="0" wp14:anchorId="6C7CEED8" wp14:editId="5FDE0C11">
             <wp:extent cx="6858000" cy="1506855"/>
@@ -3147,6 +3162,9 @@
     </w:p>
     <w:p>
       <w:r>
+        <w:rPr>
+          <w:noProof/>
+        </w:rPr>
         <w:drawing>
           <wp:inline distT="0" distB="0" distL="0" distR="0" wp14:anchorId="5C62515D" wp14:editId="6B9CE409">
             <wp:extent cx="6858000" cy="1356360"/>
@@ -3200,13 +3218,7 @@
       <w:bookmarkStart w:id="34" w:name="_Toc224078980"/>
       <w:r>
         <w:lastRenderedPageBreak/>
-        <w:t xml:space="preserve">Programa </w:t>
-      </w:r>
-      <w:r>
-        <w:t>4</w:t>
-      </w:r>
-      <w:r>
-        <w:t>:</w:t>
+        <w:t>Programa 4:</w:t>
       </w:r>
       <w:r>
         <w:t xml:space="preserve"> Empleado datos personales</w:t>
@@ -3218,6 +3230,9 @@
     </w:p>
     <w:p>
       <w:r>
+        <w:rPr>
+          <w:noProof/>
+        </w:rPr>
         <w:drawing>
           <wp:inline distT="0" distB="0" distL="0" distR="0" wp14:anchorId="3939386D" wp14:editId="38B3CBA8">
             <wp:extent cx="6858000" cy="1558290"/>
@@ -5068,6 +5083,7 @@
   <w:style w:type="character" w:default="1" w:styleId="Fuentedeprrafopredeter">
     <w:name w:val="Default Paragraph Font"/>
     <w:uiPriority w:val="1"/>
+    <w:semiHidden/>
     <w:unhideWhenUsed/>
   </w:style>
   <w:style w:type="table" w:default="1" w:styleId="Tablanormal">

</xml_diff>